<commit_message>
IQtree using the correct model per protein
</commit_message>
<xml_diff>
--- a/CPDs_Manuscript_Mary.et.al_copy.docx
+++ b/CPDs_Manuscript_Mary.et.al_copy.docx
@@ -1,6 +1,6 @@
 
 <file path=word/document.xml><?xml version="1.0" encoding="utf-8"?>
-<w:document xmlns:wpc="http://schemas.microsoft.com/office/word/2010/wordprocessingCanvas" xmlns:cx="http://schemas.microsoft.com/office/drawing/2014/chartex" xmlns:cx1="http://schemas.microsoft.com/office/drawing/2015/9/8/chartex" xmlns:cx2="http://schemas.microsoft.com/office/drawing/2015/10/21/chartex" xmlns:cx3="http://schemas.microsoft.com/office/drawing/2016/5/9/chartex" xmlns:cx4="http://schemas.microsoft.com/office/drawing/2016/5/10/chartex" xmlns:cx5="http://schemas.microsoft.com/office/drawing/2016/5/11/chartex" xmlns:cx6="http://schemas.microsoft.com/office/drawing/2016/5/12/chartex" xmlns:cx7="http://schemas.microsoft.com/office/drawing/2016/5/13/chartex" xmlns:cx8="http://schemas.microsoft.com/office/drawing/2016/5/14/chartex" xmlns:mc="http://schemas.openxmlformats.org/markup-compatibility/2006" xmlns:m="http://schemas.openxmlformats.org/officeDocument/2006/math" xmlns:aink="http://schemas.microsoft.com/office/drawing/2016/ink" xmlns:am3d="http://schemas.microsoft.com/office/drawing/2017/model3d" xmlns:oel="http://schemas.microsoft.com/office/2019/extlst" xmlns:r="http://schemas.openxmlformats.org/officeDocument/2006/relationships" xmlns:wp14="http://schemas.microsoft.com/office/word/2010/wordprocessingDrawing" xmlns:wp="http://schemas.openxmlformats.org/drawingml/2006/wordprocessingDrawing" xmlns:wpg="http://schemas.microsoft.com/office/word/2010/wordprocessingGroup" xmlns:wpi="http://schemas.microsoft.com/office/word/2010/wordprocessingInk" xmlns:wps="http://schemas.microsoft.com/office/word/2010/wordprocessingShape" xmlns:o="urn:schemas-microsoft-com:office:office" xmlns:v="urn:schemas-microsoft-com:vml" xmlns:w10="urn:schemas-microsoft-com:office:word" xmlns:w="http://schemas.openxmlformats.org/wordprocessingml/2006/main" xmlns:w14="http://schemas.microsoft.com/office/word/2010/wordml" xmlns:w15="http://schemas.microsoft.com/office/word/2012/wordml" xmlns:w16cex="http://schemas.microsoft.com/office/word/2018/wordml/cex" xmlns:w16cid="http://schemas.microsoft.com/office/word/2016/wordml/cid" xmlns:w16="http://schemas.microsoft.com/office/word/2018/wordml" xmlns:w16sdtdh="http://schemas.microsoft.com/office/word/2020/wordml/sdtdatahash" xmlns:w16sdtfl="http://schemas.microsoft.com/office/word/2024/wordml/sdtformatlock" xmlns:w16se="http://schemas.microsoft.com/office/word/2015/wordml/symex" xmlns:w16du="http://schemas.microsoft.com/office/word/2023/wordml/word16du" xmlns:wne="http://schemas.microsoft.com/office/word/2006/wordml" mc:Ignorable="w14 w15 w16se w16cid w16 w16cex w16sdtdh w16sdtfl w16du wp14">
+<w:document xmlns:wpc="http://schemas.microsoft.com/office/word/2010/wordprocessingCanvas" xmlns:cx="http://schemas.microsoft.com/office/drawing/2014/chartex" xmlns:cx1="http://schemas.microsoft.com/office/drawing/2015/9/8/chartex" xmlns:cx2="http://schemas.microsoft.com/office/drawing/2015/10/21/chartex" xmlns:cx3="http://schemas.microsoft.com/office/drawing/2016/5/9/chartex" xmlns:cx4="http://schemas.microsoft.com/office/drawing/2016/5/10/chartex" xmlns:cx5="http://schemas.microsoft.com/office/drawing/2016/5/11/chartex" xmlns:cx6="http://schemas.microsoft.com/office/drawing/2016/5/12/chartex" xmlns:cx7="http://schemas.microsoft.com/office/drawing/2016/5/13/chartex" xmlns:cx8="http://schemas.microsoft.com/office/drawing/2016/5/14/chartex" xmlns:mc="http://schemas.openxmlformats.org/markup-compatibility/2006" xmlns:aink="http://schemas.microsoft.com/office/drawing/2016/ink" xmlns:am3d="http://schemas.microsoft.com/office/drawing/2017/model3d" xmlns:o="urn:schemas-microsoft-com:office:office" xmlns:oel="http://schemas.microsoft.com/office/2019/extlst" xmlns:r="http://schemas.openxmlformats.org/officeDocument/2006/relationships" xmlns:m="http://schemas.openxmlformats.org/officeDocument/2006/math" xmlns:v="urn:schemas-microsoft-com:vml" xmlns:wp14="http://schemas.microsoft.com/office/word/2010/wordprocessingDrawing" xmlns:wp="http://schemas.openxmlformats.org/drawingml/2006/wordprocessingDrawing" xmlns:w10="urn:schemas-microsoft-com:office:word" xmlns:w="http://schemas.openxmlformats.org/wordprocessingml/2006/main" xmlns:w14="http://schemas.microsoft.com/office/word/2010/wordml" xmlns:w15="http://schemas.microsoft.com/office/word/2012/wordml" xmlns:w16cex="http://schemas.microsoft.com/office/word/2018/wordml/cex" xmlns:w16cid="http://schemas.microsoft.com/office/word/2016/wordml/cid" xmlns:w16="http://schemas.microsoft.com/office/word/2018/wordml" xmlns:w16du="http://schemas.microsoft.com/office/word/2023/wordml/word16du" xmlns:w16sdtdh="http://schemas.microsoft.com/office/word/2020/wordml/sdtdatahash" xmlns:w16sdtfl="http://schemas.microsoft.com/office/word/2024/wordml/sdtformatlock" xmlns:w16se="http://schemas.microsoft.com/office/word/2015/wordml/symex" xmlns:wpg="http://schemas.microsoft.com/office/word/2010/wordprocessingGroup" xmlns:wpi="http://schemas.microsoft.com/office/word/2010/wordprocessingInk" xmlns:wne="http://schemas.microsoft.com/office/word/2006/wordml" xmlns:wps="http://schemas.microsoft.com/office/word/2010/wordprocessingShape" mc:Ignorable="w14 w15 w16se w16cid w16 w16cex w16sdtdh w16sdtfl w16du wp14">
   <w:body>
     <w:p>
       <w:pPr>
@@ -1120,19 +1120,70 @@
         <w:rPr>
           <w:b/>
           <w:bCs/>
-          <w:sz w:val="16"/>
-          <w:szCs w:val="16"/>
         </w:rPr>
       </w:pPr>
       <w:r>
         <w:rPr>
           <w:b/>
           <w:bCs/>
-          <w:sz w:val="16"/>
-          <w:szCs w:val="16"/>
-        </w:rPr>
-        <w:lastRenderedPageBreak/>
+        </w:rPr>
         <w:t>Ancestral states</w:t>
+      </w:r>
+      <w:r>
+        <w:rPr>
+          <w:b/>
+          <w:bCs/>
+        </w:rPr>
+        <w:t xml:space="preserve"> </w:t>
+      </w:r>
+      <w:r>
+        <w:rPr>
+          <w:b/>
+          <w:bCs/>
+        </w:rPr>
+        <w:t>Rec</w:t>
+      </w:r>
+      <w:r>
+        <w:rPr>
+          <w:b/>
+          <w:bCs/>
+        </w:rPr>
+        <w:t>onstr</w:t>
+      </w:r>
+      <w:r>
+        <w:rPr>
+          <w:b/>
+          <w:bCs/>
+        </w:rPr>
+        <w:t>uctio</w:t>
+      </w:r>
+      <w:r>
+        <w:rPr>
+          <w:b/>
+          <w:bCs/>
+        </w:rPr>
+        <w:t>n (</w:t>
+      </w:r>
+      <w:r>
+        <w:rPr>
+          <w:b/>
+          <w:bCs/>
+        </w:rPr>
+        <w:t>A</w:t>
+      </w:r>
+      <w:r>
+        <w:rPr>
+          <w:b/>
+          <w:bCs/>
+        </w:rPr>
+        <w:t>SR</w:t>
+      </w:r>
+      <w:r>
+        <w:rPr>
+          <w:b/>
+          <w:bCs/>
+        </w:rPr>
+        <w:t>)</w:t>
       </w:r>
     </w:p>
     <w:p>
@@ -1849,7 +1900,7 @@
             <wp:docPr id="458071789" name="Picture 1">
               <a:extLst xmlns:a="http://schemas.openxmlformats.org/drawingml/2006/main">
                 <a:ext uri="{FF2B5EF4-FFF2-40B4-BE49-F238E27FC236}">
-                  <a16:creationId xmlns:a16="http://schemas.microsoft.com/office/drawing/2014/main" id="{1C9F81FE-8E6C-48F7-B735-AA1477BADC3A}"/>
+                  <a16:creationId xmlns:a16="http://schemas.microsoft.com/office/drawing/2014/main" id="{6E3CB6A6-EF82-4AC6-8ABE-7058FD305F27}"/>
                 </a:ext>
               </a:extLst>
             </wp:docPr>
@@ -1864,7 +1915,7 @@
                     <pic:cNvPicPr/>
                   </pic:nvPicPr>
                   <pic:blipFill>
-                    <a:blip r:embed="rId5" cstate="print">
+                    <a:blip r:embed="rId6" cstate="print">
                       <a:extLst>
                         <a:ext uri="{28A0092B-C50C-407E-A947-70E740481C1C}">
                           <a14:useLocalDpi xmlns:a14="http://schemas.microsoft.com/office/drawing/2010/main" val="0"/>
@@ -1916,7 +1967,6 @@
           <w:szCs w:val="16"/>
           <w:highlight w:val="yellow"/>
         </w:rPr>
-        <w:lastRenderedPageBreak/>
         <w:t>ACADM:</w:t>
       </w:r>
       <w:r>
@@ -2957,7 +3007,7 @@
             <wp:docPr id="721592487" name="Picture 1">
               <a:extLst xmlns:a="http://schemas.openxmlformats.org/drawingml/2006/main">
                 <a:ext uri="{FF2B5EF4-FFF2-40B4-BE49-F238E27FC236}">
-                  <a16:creationId xmlns:a16="http://schemas.microsoft.com/office/drawing/2014/main" id="{C920992C-11BA-4DD1-B43A-3081E24B27BD}"/>
+                  <a16:creationId xmlns:a16="http://schemas.microsoft.com/office/drawing/2014/main" id="{11241DFC-97FE-43AD-8F32-07822EAA8EA3}"/>
                 </a:ext>
               </a:extLst>
             </wp:docPr>
@@ -2972,7 +3022,7 @@
                     <pic:cNvPicPr/>
                   </pic:nvPicPr>
                   <pic:blipFill>
-                    <a:blip r:embed="rId6" cstate="print">
+                    <a:blip r:embed="rId7" cstate="print">
                       <a:extLst>
                         <a:ext uri="{28A0092B-C50C-407E-A947-70E740481C1C}">
                           <a14:useLocalDpi xmlns:a14="http://schemas.microsoft.com/office/drawing/2010/main" val="0"/>
@@ -3029,7 +3079,6 @@
           <w:szCs w:val="16"/>
           <w:highlight w:val="yellow"/>
         </w:rPr>
-        <w:lastRenderedPageBreak/>
         <w:t>ACADM</w:t>
       </w:r>
       <w:r>
@@ -3924,7 +3973,7 @@
             <wp:docPr id="1986875561" name="Picture 1">
               <a:extLst xmlns:a="http://schemas.openxmlformats.org/drawingml/2006/main">
                 <a:ext uri="{FF2B5EF4-FFF2-40B4-BE49-F238E27FC236}">
-                  <a16:creationId xmlns:a16="http://schemas.microsoft.com/office/drawing/2014/main" id="{14FF789E-682F-4040-826B-DA498CAD7319}"/>
+                  <a16:creationId xmlns:a16="http://schemas.microsoft.com/office/drawing/2014/main" id="{732AB6B0-0B78-4C90-88AC-409834E2DFC9}"/>
                 </a:ext>
               </a:extLst>
             </wp:docPr>
@@ -3939,7 +3988,7 @@
                     <pic:cNvPicPr/>
                   </pic:nvPicPr>
                   <pic:blipFill>
-                    <a:blip r:embed="rId7" cstate="print">
+                    <a:blip r:embed="rId8" cstate="print">
                       <a:extLst>
                         <a:ext uri="{28A0092B-C50C-407E-A947-70E740481C1C}">
                           <a14:useLocalDpi xmlns:a14="http://schemas.microsoft.com/office/drawing/2010/main" val="0"/>
@@ -4026,12 +4075,39 @@
       </w:pPr>
       <w:r>
         <w:rPr>
-          <w:rFonts w:asciiTheme="minorHAnsi" w:hAnsiTheme="minorHAnsi"/>
-          <w:sz w:val="16"/>
-          <w:szCs w:val="16"/>
-        </w:rPr>
-        <w:lastRenderedPageBreak/>
-        <w:t xml:space="preserve">IQTREE -was used to generate the </w:t>
+          <w:rFonts w:asciiTheme="majorHAnsi" w:hAnsiTheme="majorHAnsi"/>
+        </w:rPr>
+        <w:t>IQTREE</w:t>
+      </w:r>
+      <w:r>
+        <w:rPr>
+          <w:rFonts w:asciiTheme="minorHAnsi" w:hAnsiTheme="minorHAnsi"/>
+        </w:rPr>
+        <w:t xml:space="preserve"> </w:t>
+      </w:r>
+      <w:r>
+        <w:rPr>
+          <w:rFonts w:asciiTheme="minorHAnsi" w:hAnsiTheme="minorHAnsi"/>
+          <w:sz w:val="16"/>
+          <w:szCs w:val="16"/>
+        </w:rPr>
+        <w:t>-</w:t>
+      </w:r>
+      <w:r>
+        <w:rPr>
+          <w:rFonts w:asciiTheme="minorHAnsi" w:hAnsiTheme="minorHAnsi"/>
+          <w:sz w:val="16"/>
+          <w:szCs w:val="16"/>
+        </w:rPr>
+        <w:t xml:space="preserve"> </w:t>
+      </w:r>
+      <w:r>
+        <w:rPr>
+          <w:rFonts w:asciiTheme="minorHAnsi" w:hAnsiTheme="minorHAnsi"/>
+          <w:sz w:val="16"/>
+          <w:szCs w:val="16"/>
+        </w:rPr>
+        <w:t xml:space="preserve">was used to generate the </w:t>
       </w:r>
       <w:r>
         <w:rPr>
@@ -4046,6 +4122,86 @@
       <w:pPr>
         <w:rPr>
           <w:rFonts w:asciiTheme="minorHAnsi" w:hAnsiTheme="minorHAnsi"/>
+          <w:i/>
+          <w:iCs/>
+          <w:sz w:val="16"/>
+          <w:szCs w:val="16"/>
+        </w:rPr>
+      </w:pPr>
+      <w:r>
+        <w:rPr>
+          <w:rFonts w:asciiTheme="minorHAnsi" w:hAnsiTheme="minorHAnsi"/>
+          <w:i/>
+          <w:iCs/>
+          <w:sz w:val="16"/>
+          <w:szCs w:val="16"/>
+        </w:rPr>
+        <w:t xml:space="preserve">Based on </w:t>
+      </w:r>
+      <w:proofErr w:type="spellStart"/>
+      <w:r>
+        <w:rPr>
+          <w:rFonts w:asciiTheme="minorHAnsi" w:hAnsiTheme="minorHAnsi"/>
+          <w:i/>
+          <w:iCs/>
+          <w:sz w:val="16"/>
+          <w:szCs w:val="16"/>
+        </w:rPr>
+        <w:t>Maximun-likehood</w:t>
+      </w:r>
+      <w:proofErr w:type="spellEnd"/>
+    </w:p>
+    <w:p>
+      <w:pPr>
+        <w:rPr>
+          <w:rFonts w:asciiTheme="minorHAnsi" w:hAnsiTheme="minorHAnsi"/>
+          <w:sz w:val="16"/>
+          <w:szCs w:val="16"/>
+        </w:rPr>
+      </w:pPr>
+    </w:p>
+    <w:p>
+      <w:pPr>
+        <w:rPr>
+          <w:rFonts w:asciiTheme="minorHAnsi" w:hAnsiTheme="minorHAnsi"/>
+          <w:sz w:val="16"/>
+          <w:szCs w:val="16"/>
+        </w:rPr>
+      </w:pPr>
+      <w:hyperlink r:id="rId9" w:history="1">
+        <w:r>
+          <w:rPr>
+            <w:rStyle w:val="Hyperlink"/>
+            <w:rFonts w:asciiTheme="minorHAnsi" w:hAnsiTheme="minorHAnsi"/>
+            <w:sz w:val="16"/>
+            <w:szCs w:val="16"/>
+          </w:rPr>
+          <w:t>https://iqtree.github.io/doc/Quickstart</w:t>
+        </w:r>
+      </w:hyperlink>
+    </w:p>
+    <w:p>
+      <w:pPr>
+        <w:rPr>
+          <w:rFonts w:asciiTheme="minorHAnsi" w:hAnsiTheme="minorHAnsi"/>
+          <w:sz w:val="16"/>
+          <w:szCs w:val="16"/>
+        </w:rPr>
+      </w:pPr>
+    </w:p>
+    <w:p>
+      <w:pPr>
+        <w:rPr>
+          <w:rFonts w:asciiTheme="minorHAnsi" w:hAnsiTheme="minorHAnsi"/>
+          <w:sz w:val="16"/>
+          <w:szCs w:val="16"/>
+        </w:rPr>
+      </w:pPr>
+    </w:p>
+    <w:p>
+      <w:pPr>
+        <w:rPr>
+          <w:rFonts w:asciiTheme="minorHAnsi" w:hAnsiTheme="minorHAnsi"/>
           <w:sz w:val="16"/>
           <w:szCs w:val="16"/>
         </w:rPr>
@@ -4058,57 +4214,1686 @@
         </w:rPr>
         <w:t xml:space="preserve"> </w:t>
       </w:r>
+      <w:r>
+        <w:rPr>
+          <w:rFonts w:asciiTheme="minorHAnsi" w:hAnsiTheme="minorHAnsi"/>
+          <w:sz w:val="16"/>
+          <w:szCs w:val="16"/>
+        </w:rPr>
+        <w:t>F</w:t>
+      </w:r>
+      <w:r>
+        <w:rPr>
+          <w:rFonts w:asciiTheme="minorHAnsi" w:hAnsiTheme="minorHAnsi"/>
+          <w:sz w:val="16"/>
+          <w:szCs w:val="16"/>
+        </w:rPr>
+        <w:t xml:space="preserve">or </w:t>
+      </w:r>
+      <w:r>
+        <w:rPr>
+          <w:rFonts w:asciiTheme="minorHAnsi" w:hAnsiTheme="minorHAnsi"/>
+          <w:sz w:val="16"/>
+          <w:szCs w:val="16"/>
+          <w:highlight w:val="yellow"/>
+        </w:rPr>
+        <w:t>MUTYH</w:t>
+      </w:r>
+      <w:r>
+        <w:rPr>
+          <w:rFonts w:asciiTheme="minorHAnsi" w:hAnsiTheme="minorHAnsi"/>
+          <w:sz w:val="16"/>
+          <w:szCs w:val="16"/>
+        </w:rPr>
+        <w:t xml:space="preserve"> protein </w:t>
+      </w:r>
+    </w:p>
+    <w:p>
+      <w:pPr>
+        <w:rPr>
+          <w:rFonts w:asciiTheme="minorHAnsi" w:hAnsiTheme="minorHAnsi"/>
+          <w:sz w:val="16"/>
+          <w:szCs w:val="16"/>
+        </w:rPr>
+      </w:pPr>
+    </w:p>
+    <w:p>
+      <w:pPr>
+        <w:rPr>
+          <w:rFonts w:asciiTheme="minorHAnsi" w:hAnsiTheme="minorHAnsi" w:cs="Courier New"/>
+          <w:sz w:val="16"/>
+          <w:szCs w:val="16"/>
+        </w:rPr>
+      </w:pPr>
+      <w:r>
+        <w:rPr>
+          <w:rFonts w:asciiTheme="minorHAnsi" w:hAnsiTheme="minorHAnsi" w:cs="Courier New"/>
+          <w:sz w:val="16"/>
+          <w:szCs w:val="16"/>
+        </w:rPr>
+        <w:t>command line;</w:t>
+      </w:r>
+    </w:p>
+    <w:p>
+      <w:pPr>
+        <w:rPr>
+          <w:rFonts w:ascii="Courier New" w:hAnsi="Courier New" w:cs="Courier New"/>
+          <w:sz w:val="16"/>
+          <w:szCs w:val="16"/>
+        </w:rPr>
+      </w:pPr>
+    </w:p>
+    <w:p>
+      <w:pPr>
+        <w:rPr>
+          <w:rFonts w:ascii="Courier New" w:hAnsi="Courier New" w:cs="Courier New"/>
+          <w:sz w:val="16"/>
+          <w:szCs w:val="16"/>
+        </w:rPr>
+      </w:pPr>
+      <w:proofErr w:type="gramStart"/>
+      <w:r>
+        <w:rPr>
+          <w:rFonts w:ascii="Courier New" w:hAnsi="Courier New" w:cs="Courier New"/>
+          <w:sz w:val="16"/>
+          <w:szCs w:val="16"/>
+        </w:rPr>
+        <w:t>..</w:t>
+      </w:r>
+      <w:proofErr w:type="gramEnd"/>
+      <w:r>
+        <w:rPr>
+          <w:rFonts w:ascii="Courier New" w:hAnsi="Courier New" w:cs="Courier New"/>
+          <w:sz w:val="16"/>
+          <w:szCs w:val="16"/>
+        </w:rPr>
+        <w:t>/bin/iqtree3 -s MUTYH_NP_001121897.1_match_</w:t>
+      </w:r>
+      <w:proofErr w:type="gramStart"/>
+      <w:r>
+        <w:rPr>
+          <w:rFonts w:ascii="Courier New" w:hAnsi="Courier New" w:cs="Courier New"/>
+          <w:sz w:val="16"/>
+          <w:szCs w:val="16"/>
+        </w:rPr>
+        <w:t>renamed.fasta</w:t>
+      </w:r>
+      <w:proofErr w:type="gramEnd"/>
+      <w:r>
+        <w:rPr>
+          <w:rFonts w:ascii="Courier New" w:hAnsi="Courier New" w:cs="Courier New"/>
+          <w:sz w:val="16"/>
+          <w:szCs w:val="16"/>
+        </w:rPr>
+        <w:t xml:space="preserve"> -B 1000 -</w:t>
+      </w:r>
       <w:proofErr w:type="spellStart"/>
       <w:r>
         <w:rPr>
-          <w:rFonts w:asciiTheme="minorHAnsi" w:hAnsiTheme="minorHAnsi"/>
-          <w:sz w:val="16"/>
-          <w:szCs w:val="16"/>
-        </w:rPr>
-        <w:t>e.g</w:t>
+          <w:rFonts w:ascii="Courier New" w:hAnsi="Courier New" w:cs="Courier New"/>
+          <w:sz w:val="16"/>
+          <w:szCs w:val="16"/>
+        </w:rPr>
+        <w:t>alrt</w:t>
       </w:r>
       <w:proofErr w:type="spellEnd"/>
       <w:r>
         <w:rPr>
-          <w:rFonts w:asciiTheme="minorHAnsi" w:hAnsiTheme="minorHAnsi"/>
-          <w:sz w:val="16"/>
-          <w:szCs w:val="16"/>
-        </w:rPr>
-        <w:t xml:space="preserve"> for </w:t>
-      </w:r>
-      <w:r>
-        <w:rPr>
-          <w:rFonts w:asciiTheme="minorHAnsi" w:hAnsiTheme="minorHAnsi"/>
-          <w:sz w:val="16"/>
-          <w:szCs w:val="16"/>
-          <w:highlight w:val="yellow"/>
-        </w:rPr>
-        <w:t>MUTYH</w:t>
-      </w:r>
-      <w:r>
-        <w:rPr>
-          <w:rFonts w:asciiTheme="minorHAnsi" w:hAnsiTheme="minorHAnsi"/>
-          <w:sz w:val="16"/>
-          <w:szCs w:val="16"/>
-        </w:rPr>
-        <w:t xml:space="preserve"> protein </w:t>
-      </w:r>
-    </w:p>
-    <w:p>
-      <w:pPr>
-        <w:rPr>
-          <w:rFonts w:asciiTheme="minorHAnsi" w:hAnsiTheme="minorHAnsi"/>
-          <w:sz w:val="16"/>
-          <w:szCs w:val="16"/>
-        </w:rPr>
-      </w:pPr>
-    </w:p>
-    <w:p>
-      <w:pPr>
-        <w:rPr>
-          <w:rFonts w:asciiTheme="minorHAnsi" w:hAnsiTheme="minorHAnsi"/>
-          <w:sz w:val="16"/>
-          <w:szCs w:val="16"/>
+          <w:rFonts w:ascii="Courier New" w:hAnsi="Courier New" w:cs="Courier New"/>
+          <w:sz w:val="16"/>
+          <w:szCs w:val="16"/>
+        </w:rPr>
+        <w:t xml:space="preserve"> 1000</w:t>
+      </w:r>
+    </w:p>
+    <w:p>
+      <w:pPr>
+        <w:rPr>
+          <w:rFonts w:ascii="Courier New" w:hAnsi="Courier New" w:cs="Courier New"/>
+          <w:sz w:val="16"/>
+          <w:szCs w:val="16"/>
+        </w:rPr>
+      </w:pPr>
+    </w:p>
+    <w:p>
+      <w:pPr>
+        <w:rPr>
+          <w:rFonts w:asciiTheme="minorHAnsi" w:hAnsiTheme="minorHAnsi" w:cs="Courier New"/>
+          <w:sz w:val="16"/>
+          <w:szCs w:val="16"/>
+        </w:rPr>
+      </w:pPr>
+      <w:r>
+        <w:rPr>
+          <w:rFonts w:asciiTheme="minorHAnsi" w:hAnsiTheme="minorHAnsi" w:cs="Courier New"/>
+          <w:sz w:val="16"/>
+          <w:szCs w:val="16"/>
+        </w:rPr>
+        <w:t xml:space="preserve">This command generates </w:t>
+      </w:r>
+      <w:r>
+        <w:rPr>
+          <w:rFonts w:asciiTheme="minorHAnsi" w:hAnsiTheme="minorHAnsi" w:cs="Courier New"/>
+          <w:sz w:val="16"/>
+          <w:szCs w:val="16"/>
+        </w:rPr>
+        <w:t>this</w:t>
+      </w:r>
+      <w:r>
+        <w:rPr>
+          <w:rFonts w:asciiTheme="minorHAnsi" w:hAnsiTheme="minorHAnsi" w:cs="Courier New"/>
+          <w:sz w:val="16"/>
+          <w:szCs w:val="16"/>
+        </w:rPr>
+        <w:t xml:space="preserve"> set of output files;</w:t>
+      </w:r>
+    </w:p>
+    <w:p>
+      <w:pPr>
+        <w:rPr>
+          <w:rFonts w:asciiTheme="minorHAnsi" w:hAnsiTheme="minorHAnsi" w:cs="Courier New"/>
+          <w:sz w:val="16"/>
+          <w:szCs w:val="16"/>
+        </w:rPr>
+      </w:pPr>
+    </w:p>
+    <w:p>
+      <w:pPr>
+        <w:rPr>
+          <w:rFonts w:asciiTheme="minorHAnsi" w:hAnsiTheme="minorHAnsi" w:cs="Courier New"/>
+          <w:sz w:val="16"/>
+          <w:szCs w:val="16"/>
+        </w:rPr>
+      </w:pPr>
+    </w:p>
+    <w:p>
+      <w:pPr>
+        <w:rPr>
+          <w:rFonts w:asciiTheme="minorHAnsi" w:hAnsiTheme="minorHAnsi" w:cs="Courier New"/>
+          <w:sz w:val="16"/>
+          <w:szCs w:val="16"/>
+        </w:rPr>
+      </w:pPr>
+      <w:r>
+        <w:rPr>
+          <w:rFonts w:asciiTheme="minorHAnsi" w:hAnsiTheme="minorHAnsi" w:cs="Courier New"/>
+          <w:noProof/>
+          <w:sz w:val="16"/>
+          <w:szCs w:val="16"/>
+        </w:rPr>
+        <w:drawing>
+          <wp:anchor distT="0" distB="0" distL="114300" distR="114300" simplePos="0" relativeHeight="251658243" behindDoc="1" locked="0" layoutInCell="1" allowOverlap="1" wp14:anchorId="2550FF16" wp14:editId="6028268A">
+            <wp:simplePos x="0" y="0"/>
+            <wp:positionH relativeFrom="column">
+              <wp:posOffset>0</wp:posOffset>
+            </wp:positionH>
+            <wp:positionV relativeFrom="paragraph">
+              <wp:posOffset>53632</wp:posOffset>
+            </wp:positionV>
+            <wp:extent cx="3455233" cy="1687379"/>
+            <wp:effectExtent l="0" t="0" r="0" b="1905"/>
+            <wp:wrapTight wrapText="bothSides">
+              <wp:wrapPolygon edited="0">
+                <wp:start x="0" y="0"/>
+                <wp:lineTo x="0" y="21462"/>
+                <wp:lineTo x="21517" y="21462"/>
+                <wp:lineTo x="21517" y="0"/>
+                <wp:lineTo x="0" y="0"/>
+              </wp:wrapPolygon>
+            </wp:wrapTight>
+            <wp:docPr id="2027166704" name="Picture 1">
+              <a:extLst xmlns:a="http://schemas.openxmlformats.org/drawingml/2006/main">
+                <a:ext uri="{FF2B5EF4-FFF2-40B4-BE49-F238E27FC236}">
+                  <a16:creationId xmlns:a16="http://schemas.microsoft.com/office/drawing/2014/main" id="{2EC5CFF8-7A58-4327-80B7-17538CD5BAE2}"/>
+                </a:ext>
+              </a:extLst>
+            </wp:docPr>
+            <wp:cNvGraphicFramePr>
+              <a:graphicFrameLocks xmlns:a="http://schemas.openxmlformats.org/drawingml/2006/main" noChangeAspect="1"/>
+            </wp:cNvGraphicFramePr>
+            <a:graphic xmlns:a="http://schemas.openxmlformats.org/drawingml/2006/main">
+              <a:graphicData uri="http://schemas.openxmlformats.org/drawingml/2006/picture">
+                <pic:pic xmlns:pic="http://schemas.openxmlformats.org/drawingml/2006/picture">
+                  <pic:nvPicPr>
+                    <pic:cNvPr id="2027166704" name=""/>
+                    <pic:cNvPicPr/>
+                  </pic:nvPicPr>
+                  <pic:blipFill>
+                    <a:blip r:embed="rId10" cstate="print">
+                      <a:extLst>
+                        <a:ext uri="{28A0092B-C50C-407E-A947-70E740481C1C}">
+                          <a14:useLocalDpi xmlns:a14="http://schemas.microsoft.com/office/drawing/2010/main" val="0"/>
+                        </a:ext>
+                      </a:extLst>
+                    </a:blip>
+                    <a:stretch>
+                      <a:fillRect/>
+                    </a:stretch>
+                  </pic:blipFill>
+                  <pic:spPr>
+                    <a:xfrm>
+                      <a:off x="0" y="0"/>
+                      <a:ext cx="3455233" cy="1687379"/>
+                    </a:xfrm>
+                    <a:prstGeom prst="rect">
+                      <a:avLst/>
+                    </a:prstGeom>
+                  </pic:spPr>
+                </pic:pic>
+              </a:graphicData>
+            </a:graphic>
+            <wp14:sizeRelH relativeFrom="page">
+              <wp14:pctWidth>0</wp14:pctWidth>
+            </wp14:sizeRelH>
+            <wp14:sizeRelV relativeFrom="page">
+              <wp14:pctHeight>0</wp14:pctHeight>
+            </wp14:sizeRelV>
+          </wp:anchor>
+        </w:drawing>
+      </w:r>
+    </w:p>
+    <w:p>
+      <w:pPr>
+        <w:rPr>
+          <w:rFonts w:asciiTheme="minorHAnsi" w:hAnsiTheme="minorHAnsi" w:cs="Courier New"/>
+          <w:sz w:val="16"/>
+          <w:szCs w:val="16"/>
+        </w:rPr>
+      </w:pPr>
+    </w:p>
+    <w:p>
+      <w:pPr>
+        <w:rPr>
+          <w:rFonts w:asciiTheme="minorHAnsi" w:hAnsiTheme="minorHAnsi" w:cs="Courier New"/>
+          <w:sz w:val="16"/>
+          <w:szCs w:val="16"/>
+        </w:rPr>
+      </w:pPr>
+    </w:p>
+    <w:p>
+      <w:pPr>
+        <w:rPr>
+          <w:rFonts w:asciiTheme="minorHAnsi" w:hAnsiTheme="minorHAnsi" w:cs="Courier New"/>
+          <w:sz w:val="16"/>
+          <w:szCs w:val="16"/>
+        </w:rPr>
+      </w:pPr>
+    </w:p>
+    <w:p>
+      <w:pPr>
+        <w:rPr>
+          <w:rFonts w:asciiTheme="minorHAnsi" w:hAnsiTheme="minorHAnsi" w:cs="Courier New"/>
+          <w:sz w:val="16"/>
+          <w:szCs w:val="16"/>
+        </w:rPr>
+      </w:pPr>
+    </w:p>
+    <w:p>
+      <w:pPr>
+        <w:rPr>
+          <w:rFonts w:asciiTheme="minorHAnsi" w:hAnsiTheme="minorHAnsi" w:cs="Courier New"/>
+          <w:sz w:val="16"/>
+          <w:szCs w:val="16"/>
+        </w:rPr>
+      </w:pPr>
+    </w:p>
+    <w:p>
+      <w:pPr>
+        <w:rPr>
+          <w:rFonts w:asciiTheme="minorHAnsi" w:hAnsiTheme="minorHAnsi" w:cs="Courier New"/>
+          <w:sz w:val="16"/>
+          <w:szCs w:val="16"/>
+        </w:rPr>
+      </w:pPr>
+    </w:p>
+    <w:p>
+      <w:pPr>
+        <w:rPr>
+          <w:rFonts w:asciiTheme="minorHAnsi" w:hAnsiTheme="minorHAnsi" w:cs="Courier New"/>
+          <w:sz w:val="16"/>
+          <w:szCs w:val="16"/>
+        </w:rPr>
+      </w:pPr>
+    </w:p>
+    <w:p>
+      <w:pPr>
+        <w:rPr>
+          <w:rFonts w:asciiTheme="minorHAnsi" w:hAnsiTheme="minorHAnsi" w:cs="Courier New"/>
+          <w:sz w:val="16"/>
+          <w:szCs w:val="16"/>
+        </w:rPr>
+      </w:pPr>
+    </w:p>
+    <w:p>
+      <w:pPr>
+        <w:rPr>
+          <w:rFonts w:asciiTheme="minorHAnsi" w:hAnsiTheme="minorHAnsi" w:cs="Courier New"/>
+          <w:sz w:val="16"/>
+          <w:szCs w:val="16"/>
+        </w:rPr>
+      </w:pPr>
+    </w:p>
+    <w:p>
+      <w:pPr>
+        <w:rPr>
+          <w:rFonts w:asciiTheme="minorHAnsi" w:hAnsiTheme="minorHAnsi" w:cs="Courier New"/>
+          <w:sz w:val="16"/>
+          <w:szCs w:val="16"/>
+        </w:rPr>
+      </w:pPr>
+    </w:p>
+    <w:p>
+      <w:pPr>
+        <w:rPr>
+          <w:rFonts w:asciiTheme="minorHAnsi" w:hAnsiTheme="minorHAnsi" w:cs="Courier New"/>
+          <w:sz w:val="16"/>
+          <w:szCs w:val="16"/>
+        </w:rPr>
+      </w:pPr>
+    </w:p>
+    <w:p>
+      <w:pPr>
+        <w:rPr>
+          <w:rFonts w:asciiTheme="minorHAnsi" w:hAnsiTheme="minorHAnsi" w:cs="Courier New"/>
+          <w:sz w:val="16"/>
+          <w:szCs w:val="16"/>
+        </w:rPr>
+      </w:pPr>
+    </w:p>
+    <w:p>
+      <w:pPr>
+        <w:rPr>
+          <w:rFonts w:asciiTheme="minorHAnsi" w:hAnsiTheme="minorHAnsi" w:cs="Courier New"/>
+          <w:sz w:val="16"/>
+          <w:szCs w:val="16"/>
+        </w:rPr>
+      </w:pPr>
+    </w:p>
+    <w:p>
+      <w:pPr>
+        <w:rPr>
+          <w:rFonts w:asciiTheme="minorHAnsi" w:hAnsiTheme="minorHAnsi" w:cs="Courier New"/>
+          <w:sz w:val="16"/>
+          <w:szCs w:val="16"/>
+        </w:rPr>
+      </w:pPr>
+    </w:p>
+    <w:p>
+      <w:pPr>
+        <w:rPr>
+          <w:rFonts w:asciiTheme="minorHAnsi" w:hAnsiTheme="minorHAnsi" w:cs="Courier New"/>
+          <w:sz w:val="16"/>
+          <w:szCs w:val="16"/>
+        </w:rPr>
+      </w:pPr>
+      <w:r>
+        <w:rPr>
+          <w:rFonts w:asciiTheme="minorHAnsi" w:hAnsiTheme="minorHAnsi" w:cs="Courier New"/>
+          <w:sz w:val="16"/>
+          <w:szCs w:val="16"/>
+        </w:rPr>
+        <w:t xml:space="preserve">Analysis results written to: </w:t>
+      </w:r>
+    </w:p>
+    <w:p>
+      <w:pPr>
+        <w:rPr>
+          <w:rFonts w:asciiTheme="minorHAnsi" w:hAnsiTheme="minorHAnsi" w:cs="Courier New"/>
+          <w:b/>
+          <w:bCs/>
+          <w:color w:val="A02B93" w:themeColor="accent5"/>
+          <w:sz w:val="16"/>
+          <w:szCs w:val="16"/>
+        </w:rPr>
+      </w:pPr>
+      <w:r>
+        <w:rPr>
+          <w:rFonts w:asciiTheme="minorHAnsi" w:hAnsiTheme="minorHAnsi" w:cs="Courier New"/>
+          <w:b/>
+          <w:bCs/>
+          <w:color w:val="A02B93" w:themeColor="accent5"/>
+          <w:sz w:val="16"/>
+          <w:szCs w:val="16"/>
+        </w:rPr>
+        <w:t xml:space="preserve">  IQ-TREE report:                MUTYH_NP_001121897.1_match_</w:t>
+      </w:r>
+      <w:proofErr w:type="gramStart"/>
+      <w:r>
+        <w:rPr>
+          <w:rFonts w:asciiTheme="minorHAnsi" w:hAnsiTheme="minorHAnsi" w:cs="Courier New"/>
+          <w:b/>
+          <w:bCs/>
+          <w:color w:val="A02B93" w:themeColor="accent5"/>
+          <w:sz w:val="16"/>
+          <w:szCs w:val="16"/>
+        </w:rPr>
+        <w:t>renamed.fasta</w:t>
+      </w:r>
+      <w:proofErr w:type="gramEnd"/>
+      <w:r>
+        <w:rPr>
+          <w:rFonts w:asciiTheme="minorHAnsi" w:hAnsiTheme="minorHAnsi" w:cs="Courier New"/>
+          <w:b/>
+          <w:bCs/>
+          <w:color w:val="A02B93" w:themeColor="accent5"/>
+          <w:sz w:val="16"/>
+          <w:szCs w:val="16"/>
+        </w:rPr>
+        <w:t>.iqtree</w:t>
+      </w:r>
+      <w:r>
+        <w:rPr>
+          <w:rFonts w:asciiTheme="minorHAnsi" w:hAnsiTheme="minorHAnsi" w:cs="Courier New"/>
+          <w:b/>
+          <w:bCs/>
+          <w:color w:val="A02B93" w:themeColor="accent5"/>
+          <w:sz w:val="16"/>
+          <w:szCs w:val="16"/>
+        </w:rPr>
+        <w:t xml:space="preserve"> </w:t>
+      </w:r>
+    </w:p>
+    <w:p>
+      <w:pPr>
+        <w:rPr>
+          <w:rFonts w:asciiTheme="minorHAnsi" w:hAnsiTheme="minorHAnsi" w:cs="Courier New"/>
+          <w:sz w:val="16"/>
+          <w:szCs w:val="16"/>
+        </w:rPr>
+      </w:pPr>
+      <w:r>
+        <w:rPr>
+          <w:rFonts w:asciiTheme="minorHAnsi" w:hAnsiTheme="minorHAnsi" w:cs="Courier New"/>
+          <w:sz w:val="16"/>
+          <w:szCs w:val="16"/>
+        </w:rPr>
+        <w:t xml:space="preserve">  Maximum-likelihood tree:       MUTYH_NP_001121897.1_match_</w:t>
+      </w:r>
+      <w:proofErr w:type="gramStart"/>
+      <w:r>
+        <w:rPr>
+          <w:rFonts w:asciiTheme="minorHAnsi" w:hAnsiTheme="minorHAnsi" w:cs="Courier New"/>
+          <w:sz w:val="16"/>
+          <w:szCs w:val="16"/>
+        </w:rPr>
+        <w:t>renamed.fasta</w:t>
+      </w:r>
+      <w:proofErr w:type="gramEnd"/>
+      <w:r>
+        <w:rPr>
+          <w:rFonts w:asciiTheme="minorHAnsi" w:hAnsiTheme="minorHAnsi" w:cs="Courier New"/>
+          <w:sz w:val="16"/>
+          <w:szCs w:val="16"/>
+        </w:rPr>
+        <w:t>.treefile</w:t>
+      </w:r>
+    </w:p>
+    <w:p>
+      <w:pPr>
+        <w:rPr>
+          <w:rFonts w:asciiTheme="minorHAnsi" w:hAnsiTheme="minorHAnsi" w:cs="Courier New"/>
+          <w:sz w:val="16"/>
+          <w:szCs w:val="16"/>
+        </w:rPr>
+      </w:pPr>
+      <w:r>
+        <w:rPr>
+          <w:rFonts w:asciiTheme="minorHAnsi" w:hAnsiTheme="minorHAnsi" w:cs="Courier New"/>
+          <w:sz w:val="16"/>
+          <w:szCs w:val="16"/>
+        </w:rPr>
+        <w:t xml:space="preserve">  Likelihood distances:          MUTYH_NP_001121897.1_match_</w:t>
+      </w:r>
+      <w:proofErr w:type="gramStart"/>
+      <w:r>
+        <w:rPr>
+          <w:rFonts w:asciiTheme="minorHAnsi" w:hAnsiTheme="minorHAnsi" w:cs="Courier New"/>
+          <w:sz w:val="16"/>
+          <w:szCs w:val="16"/>
+        </w:rPr>
+        <w:t>renamed.fasta</w:t>
+      </w:r>
+      <w:proofErr w:type="gramEnd"/>
+      <w:r>
+        <w:rPr>
+          <w:rFonts w:asciiTheme="minorHAnsi" w:hAnsiTheme="minorHAnsi" w:cs="Courier New"/>
+          <w:sz w:val="16"/>
+          <w:szCs w:val="16"/>
+        </w:rPr>
+        <w:t>.mldist</w:t>
+      </w:r>
+    </w:p>
+    <w:p>
+      <w:pPr>
+        <w:rPr>
+          <w:rFonts w:asciiTheme="minorHAnsi" w:hAnsiTheme="minorHAnsi" w:cs="Courier New"/>
+          <w:sz w:val="16"/>
+          <w:szCs w:val="16"/>
+        </w:rPr>
+      </w:pPr>
+    </w:p>
+    <w:p>
+      <w:pPr>
+        <w:rPr>
+          <w:rFonts w:asciiTheme="minorHAnsi" w:hAnsiTheme="minorHAnsi" w:cs="Courier New"/>
+          <w:sz w:val="16"/>
+          <w:szCs w:val="16"/>
+        </w:rPr>
+      </w:pPr>
+      <w:r>
+        <w:rPr>
+          <w:rFonts w:asciiTheme="minorHAnsi" w:hAnsiTheme="minorHAnsi" w:cs="Courier New"/>
+          <w:sz w:val="16"/>
+          <w:szCs w:val="16"/>
+        </w:rPr>
+        <w:t>Ultrafast bootstrap approximation results written to:</w:t>
+      </w:r>
+    </w:p>
+    <w:p>
+      <w:pPr>
+        <w:rPr>
+          <w:rFonts w:asciiTheme="minorHAnsi" w:hAnsiTheme="minorHAnsi" w:cs="Courier New"/>
+          <w:sz w:val="16"/>
+          <w:szCs w:val="16"/>
+        </w:rPr>
+      </w:pPr>
+      <w:r>
+        <w:rPr>
+          <w:rFonts w:asciiTheme="minorHAnsi" w:hAnsiTheme="minorHAnsi" w:cs="Courier New"/>
+          <w:sz w:val="16"/>
+          <w:szCs w:val="16"/>
+        </w:rPr>
+        <w:t xml:space="preserve">  Split support values:          MUTYH_NP_001121897.1_match_renamed.fasta.splits.nex</w:t>
+      </w:r>
+    </w:p>
+    <w:p>
+      <w:pPr>
+        <w:rPr>
+          <w:rFonts w:asciiTheme="minorHAnsi" w:hAnsiTheme="minorHAnsi" w:cs="Courier New"/>
+          <w:sz w:val="16"/>
+          <w:szCs w:val="16"/>
+        </w:rPr>
+      </w:pPr>
+      <w:r>
+        <w:rPr>
+          <w:rFonts w:asciiTheme="minorHAnsi" w:hAnsiTheme="minorHAnsi" w:cs="Courier New"/>
+          <w:sz w:val="16"/>
+          <w:szCs w:val="16"/>
+        </w:rPr>
+        <w:t xml:space="preserve">  Consensus tree:                MUTYH_NP_001121897.1_match_</w:t>
+      </w:r>
+      <w:proofErr w:type="gramStart"/>
+      <w:r>
+        <w:rPr>
+          <w:rFonts w:asciiTheme="minorHAnsi" w:hAnsiTheme="minorHAnsi" w:cs="Courier New"/>
+          <w:sz w:val="16"/>
+          <w:szCs w:val="16"/>
+        </w:rPr>
+        <w:t>renamed.fasta</w:t>
+      </w:r>
+      <w:proofErr w:type="gramEnd"/>
+      <w:r>
+        <w:rPr>
+          <w:rFonts w:asciiTheme="minorHAnsi" w:hAnsiTheme="minorHAnsi" w:cs="Courier New"/>
+          <w:sz w:val="16"/>
+          <w:szCs w:val="16"/>
+        </w:rPr>
+        <w:t>.contree</w:t>
+      </w:r>
+    </w:p>
+    <w:p>
+      <w:pPr>
+        <w:rPr>
+          <w:rFonts w:asciiTheme="minorHAnsi" w:hAnsiTheme="minorHAnsi" w:cs="Courier New"/>
+          <w:sz w:val="16"/>
+          <w:szCs w:val="16"/>
+        </w:rPr>
+      </w:pPr>
+      <w:r>
+        <w:rPr>
+          <w:rFonts w:asciiTheme="minorHAnsi" w:hAnsiTheme="minorHAnsi" w:cs="Courier New"/>
+          <w:sz w:val="16"/>
+          <w:szCs w:val="16"/>
+        </w:rPr>
+        <w:t xml:space="preserve">  Screen log file:               MUTYH_NP_001121897.1_match_renamed.fasta.log</w:t>
+      </w:r>
+    </w:p>
+    <w:p>
+      <w:pPr>
+        <w:spacing w:after="160" w:line="278" w:lineRule="auto"/>
+        <w:rPr>
+          <w:rFonts w:asciiTheme="minorHAnsi" w:hAnsiTheme="minorHAnsi" w:cs="Courier New"/>
+          <w:sz w:val="16"/>
+          <w:szCs w:val="16"/>
+        </w:rPr>
+      </w:pPr>
+      <w:r>
+        <w:rPr>
+          <w:rFonts w:asciiTheme="minorHAnsi" w:hAnsiTheme="minorHAnsi" w:cs="Courier New"/>
+          <w:sz w:val="16"/>
+          <w:szCs w:val="16"/>
+        </w:rPr>
+        <w:br w:type="page"/>
+      </w:r>
+    </w:p>
+    <w:p>
+      <w:pPr>
+        <w:rPr>
+          <w:rFonts w:asciiTheme="minorHAnsi" w:hAnsiTheme="minorHAnsi" w:cs="Courier New"/>
+          <w:sz w:val="16"/>
+          <w:szCs w:val="16"/>
+        </w:rPr>
+      </w:pPr>
+      <w:proofErr w:type="spellStart"/>
+      <w:r>
+        <w:rPr>
+          <w:rFonts w:asciiTheme="majorHAnsi" w:hAnsiTheme="majorHAnsi" w:cs="Courier New"/>
+          <w:sz w:val="21"/>
+          <w:szCs w:val="21"/>
+        </w:rPr>
+        <w:t>FastML</w:t>
+      </w:r>
+      <w:proofErr w:type="spellEnd"/>
+      <w:r>
+        <w:rPr>
+          <w:rFonts w:asciiTheme="majorHAnsi" w:hAnsiTheme="majorHAnsi" w:cs="Courier New"/>
+          <w:sz w:val="21"/>
+          <w:szCs w:val="21"/>
+        </w:rPr>
+        <w:t xml:space="preserve"> </w:t>
+      </w:r>
+      <w:r>
+        <w:rPr>
+          <w:rFonts w:asciiTheme="minorHAnsi" w:hAnsiTheme="minorHAnsi" w:cs="Courier New"/>
+          <w:sz w:val="16"/>
+          <w:szCs w:val="16"/>
+        </w:rPr>
+        <w:t>is used to generate the ancestral sequence state</w:t>
+      </w:r>
+    </w:p>
+    <w:p>
+      <w:pPr>
+        <w:rPr>
+          <w:rFonts w:asciiTheme="minorHAnsi" w:hAnsiTheme="minorHAnsi" w:cs="Courier New"/>
+          <w:sz w:val="16"/>
+          <w:szCs w:val="16"/>
+        </w:rPr>
+      </w:pPr>
+    </w:p>
+    <w:p>
+      <w:pPr>
+        <w:rPr>
+          <w:rFonts w:asciiTheme="minorHAnsi" w:hAnsiTheme="minorHAnsi" w:cs="Courier New"/>
+          <w:sz w:val="16"/>
+          <w:szCs w:val="16"/>
+        </w:rPr>
+      </w:pPr>
+      <w:r>
+        <w:rPr>
+          <w:rFonts w:asciiTheme="minorHAnsi" w:hAnsiTheme="minorHAnsi" w:cs="Courier New"/>
+          <w:sz w:val="16"/>
+          <w:szCs w:val="16"/>
+        </w:rPr>
+        <w:t>Command line;</w:t>
+      </w:r>
+    </w:p>
+    <w:p>
+      <w:pPr>
+        <w:rPr>
+          <w:rFonts w:ascii="Courier New" w:hAnsi="Courier New" w:cs="Courier New"/>
+          <w:sz w:val="16"/>
+          <w:szCs w:val="16"/>
+        </w:rPr>
+      </w:pPr>
+    </w:p>
+    <w:p>
+      <w:pPr>
+        <w:rPr>
+          <w:rFonts w:ascii="Courier New" w:hAnsi="Courier New" w:cs="Courier New"/>
+          <w:sz w:val="16"/>
+          <w:szCs w:val="16"/>
+        </w:rPr>
+      </w:pPr>
+      <w:proofErr w:type="spellStart"/>
+      <w:r>
+        <w:rPr>
+          <w:rFonts w:ascii="Courier New" w:hAnsi="Courier New" w:cs="Courier New"/>
+          <w:sz w:val="16"/>
+          <w:szCs w:val="16"/>
+        </w:rPr>
+        <w:t>fastml</w:t>
+      </w:r>
+      <w:proofErr w:type="spellEnd"/>
+      <w:r>
+        <w:rPr>
+          <w:rFonts w:ascii="Courier New" w:hAnsi="Courier New" w:cs="Courier New"/>
+          <w:sz w:val="16"/>
+          <w:szCs w:val="16"/>
+        </w:rPr>
+        <w:t xml:space="preserve"> -s ACADM_NP_000007.1_match_</w:t>
+      </w:r>
+      <w:proofErr w:type="gramStart"/>
+      <w:r>
+        <w:rPr>
+          <w:rFonts w:ascii="Courier New" w:hAnsi="Courier New" w:cs="Courier New"/>
+          <w:sz w:val="16"/>
+          <w:szCs w:val="16"/>
+        </w:rPr>
+        <w:t>copy.fasta</w:t>
+      </w:r>
+      <w:proofErr w:type="gramEnd"/>
+      <w:r>
+        <w:rPr>
+          <w:rFonts w:ascii="Courier New" w:hAnsi="Courier New" w:cs="Courier New"/>
+          <w:sz w:val="16"/>
+          <w:szCs w:val="16"/>
+        </w:rPr>
+        <w:t xml:space="preserve"> -t ACADM_NP_000007.1_</w:t>
+      </w:r>
+      <w:proofErr w:type="gramStart"/>
+      <w:r>
+        <w:rPr>
+          <w:rFonts w:ascii="Courier New" w:hAnsi="Courier New" w:cs="Courier New"/>
+          <w:sz w:val="16"/>
+          <w:szCs w:val="16"/>
+        </w:rPr>
+        <w:t>match.Newick</w:t>
+      </w:r>
+      <w:proofErr w:type="gramEnd"/>
+      <w:r>
+        <w:rPr>
+          <w:rFonts w:ascii="Courier New" w:hAnsi="Courier New" w:cs="Courier New"/>
+          <w:sz w:val="16"/>
+          <w:szCs w:val="16"/>
+        </w:rPr>
+        <w:t xml:space="preserve"> -</w:t>
+      </w:r>
+      <w:proofErr w:type="spellStart"/>
+      <w:r>
+        <w:rPr>
+          <w:rFonts w:ascii="Courier New" w:hAnsi="Courier New" w:cs="Courier New"/>
+          <w:sz w:val="16"/>
+          <w:szCs w:val="16"/>
+        </w:rPr>
+        <w:t>mj</w:t>
+      </w:r>
+      <w:proofErr w:type="spellEnd"/>
+    </w:p>
+    <w:p>
+      <w:pPr>
+        <w:rPr>
+          <w:rFonts w:ascii="Courier New" w:hAnsi="Courier New" w:cs="Courier New"/>
+          <w:sz w:val="16"/>
+          <w:szCs w:val="16"/>
+        </w:rPr>
+      </w:pPr>
+    </w:p>
+    <w:p>
+      <w:pPr>
+        <w:rPr>
+          <w:rFonts w:ascii="Courier New" w:hAnsi="Courier New" w:cs="Courier New"/>
+          <w:sz w:val="16"/>
+          <w:szCs w:val="16"/>
+        </w:rPr>
+      </w:pPr>
+    </w:p>
+    <w:p>
+      <w:pPr>
+        <w:rPr>
+          <w:rFonts w:ascii="Courier New" w:hAnsi="Courier New" w:cs="Courier New"/>
+          <w:sz w:val="16"/>
+          <w:szCs w:val="16"/>
+        </w:rPr>
+      </w:pPr>
+      <w:r>
+        <w:rPr>
+          <w:rFonts w:ascii="Courier New" w:hAnsi="Courier New" w:cs="Courier New"/>
+          <w:sz w:val="16"/>
+          <w:szCs w:val="16"/>
+        </w:rPr>
+        <w:br w:type="page"/>
+      </w:r>
+      <w:r>
+        <w:rPr>
+          <w:rFonts w:ascii="Courier New" w:hAnsi="Courier New" w:cs="Courier New"/>
+          <w:sz w:val="16"/>
+          <w:szCs w:val="16"/>
+        </w:rPr>
+        <w:br w:type="page"/>
+      </w:r>
+    </w:p>
+    <w:p>
+      <w:pPr>
+        <w:spacing w:after="160" w:line="278" w:lineRule="auto"/>
+        <w:rPr>
+          <w:rFonts w:asciiTheme="majorHAnsi" w:hAnsiTheme="majorHAnsi" w:cs="Courier New"/>
+          <w:sz w:val="36"/>
+          <w:szCs w:val="36"/>
+        </w:rPr>
+      </w:pPr>
+      <w:r>
+        <w:rPr>
+          <w:rFonts w:asciiTheme="majorHAnsi" w:hAnsiTheme="majorHAnsi" w:cs="Courier New"/>
+          <w:sz w:val="36"/>
+          <w:szCs w:val="36"/>
+        </w:rPr>
+        <w:t>C</w:t>
+      </w:r>
+      <w:r>
+        <w:rPr>
+          <w:rFonts w:asciiTheme="majorHAnsi" w:hAnsiTheme="majorHAnsi" w:cs="Courier New"/>
+          <w:sz w:val="36"/>
+          <w:szCs w:val="36"/>
+        </w:rPr>
+        <w:t>orre</w:t>
+      </w:r>
+      <w:r>
+        <w:rPr>
+          <w:rFonts w:asciiTheme="majorHAnsi" w:hAnsiTheme="majorHAnsi" w:cs="Courier New"/>
+          <w:sz w:val="36"/>
+          <w:szCs w:val="36"/>
+        </w:rPr>
+        <w:t xml:space="preserve">ct </w:t>
+      </w:r>
+      <w:r>
+        <w:rPr>
+          <w:rFonts w:asciiTheme="majorHAnsi" w:hAnsiTheme="majorHAnsi" w:cs="Courier New"/>
+          <w:sz w:val="36"/>
+          <w:szCs w:val="36"/>
+        </w:rPr>
+        <w:t>A</w:t>
+      </w:r>
+      <w:r>
+        <w:rPr>
+          <w:rFonts w:asciiTheme="majorHAnsi" w:hAnsiTheme="majorHAnsi" w:cs="Courier New"/>
+          <w:sz w:val="36"/>
+          <w:szCs w:val="36"/>
+        </w:rPr>
+        <w:t>nal</w:t>
+      </w:r>
+      <w:r>
+        <w:rPr>
+          <w:rFonts w:asciiTheme="majorHAnsi" w:hAnsiTheme="majorHAnsi" w:cs="Courier New"/>
+          <w:sz w:val="36"/>
+          <w:szCs w:val="36"/>
+        </w:rPr>
+        <w:t xml:space="preserve">ysis </w:t>
+      </w:r>
+      <w:r>
+        <w:rPr>
+          <w:rFonts w:asciiTheme="majorHAnsi" w:hAnsiTheme="majorHAnsi" w:cs="Courier New"/>
+          <w:sz w:val="36"/>
+          <w:szCs w:val="36"/>
+        </w:rPr>
+        <w:t>Pipeline</w:t>
+      </w:r>
+    </w:p>
+    <w:tbl>
+      <w:tblPr>
+        <w:tblStyle w:val="TableGrid"/>
+        <w:tblW w:w="9625" w:type="dxa"/>
+        <w:tblLook w:val="04A0" w:firstRow="1" w:lastRow="0" w:firstColumn="1" w:lastColumn="0" w:noHBand="0" w:noVBand="1"/>
+      </w:tblPr>
+      <w:tblGrid>
+        <w:gridCol w:w="1565"/>
+        <w:gridCol w:w="1671"/>
+        <w:gridCol w:w="1568"/>
+        <w:gridCol w:w="1355"/>
+        <w:gridCol w:w="3466"/>
+      </w:tblGrid>
+      <w:tr>
+        <w:tc>
+          <w:tcPr>
+            <w:tcW w:w="1565" w:type="dxa"/>
+          </w:tcPr>
+          <w:p>
+            <w:pPr>
+              <w:spacing w:after="160" w:line="278" w:lineRule="auto"/>
+              <w:rPr>
+                <w:rFonts w:asciiTheme="majorHAnsi" w:hAnsiTheme="majorHAnsi" w:cs="Courier New"/>
+                <w:sz w:val="18"/>
+                <w:szCs w:val="18"/>
+              </w:rPr>
+            </w:pPr>
+            <w:r>
+              <w:rPr>
+                <w:rFonts w:asciiTheme="majorHAnsi" w:hAnsiTheme="majorHAnsi" w:cs="Courier New"/>
+                <w:sz w:val="18"/>
+                <w:szCs w:val="18"/>
+              </w:rPr>
+              <w:t>Tool</w:t>
+            </w:r>
+          </w:p>
+        </w:tc>
+        <w:tc>
+          <w:tcPr>
+            <w:tcW w:w="1671" w:type="dxa"/>
+          </w:tcPr>
+          <w:p>
+            <w:pPr>
+              <w:spacing w:after="160" w:line="278" w:lineRule="auto"/>
+              <w:rPr>
+                <w:rFonts w:asciiTheme="majorHAnsi" w:hAnsiTheme="majorHAnsi" w:cs="Courier New"/>
+                <w:sz w:val="18"/>
+                <w:szCs w:val="18"/>
+              </w:rPr>
+            </w:pPr>
+            <w:r>
+              <w:rPr>
+                <w:rFonts w:asciiTheme="majorHAnsi" w:hAnsiTheme="majorHAnsi" w:cs="Courier New"/>
+                <w:sz w:val="18"/>
+                <w:szCs w:val="18"/>
+              </w:rPr>
+              <w:t>R</w:t>
+            </w:r>
+            <w:r>
+              <w:rPr>
+                <w:rFonts w:asciiTheme="majorHAnsi" w:hAnsiTheme="majorHAnsi" w:cs="Courier New"/>
+                <w:sz w:val="18"/>
+                <w:szCs w:val="18"/>
+              </w:rPr>
+              <w:t>ole</w:t>
+            </w:r>
+          </w:p>
+        </w:tc>
+        <w:tc>
+          <w:tcPr>
+            <w:tcW w:w="1568" w:type="dxa"/>
+          </w:tcPr>
+          <w:p>
+            <w:pPr>
+              <w:spacing w:after="160" w:line="278" w:lineRule="auto"/>
+              <w:rPr>
+                <w:rFonts w:asciiTheme="majorHAnsi" w:hAnsiTheme="majorHAnsi" w:cs="Courier New"/>
+                <w:sz w:val="18"/>
+                <w:szCs w:val="18"/>
+              </w:rPr>
+            </w:pPr>
+            <w:r>
+              <w:rPr>
+                <w:rFonts w:asciiTheme="majorHAnsi" w:hAnsiTheme="majorHAnsi" w:cs="Courier New"/>
+                <w:sz w:val="18"/>
+                <w:szCs w:val="18"/>
+              </w:rPr>
+              <w:t>O</w:t>
+            </w:r>
+            <w:r>
+              <w:rPr>
+                <w:rFonts w:asciiTheme="majorHAnsi" w:hAnsiTheme="majorHAnsi" w:cs="Courier New"/>
+                <w:sz w:val="18"/>
+                <w:szCs w:val="18"/>
+              </w:rPr>
+              <w:t>utp</w:t>
+            </w:r>
+            <w:r>
+              <w:rPr>
+                <w:rFonts w:asciiTheme="majorHAnsi" w:hAnsiTheme="majorHAnsi" w:cs="Courier New"/>
+                <w:sz w:val="18"/>
+                <w:szCs w:val="18"/>
+              </w:rPr>
+              <w:t>ut file</w:t>
+            </w:r>
+          </w:p>
+        </w:tc>
+        <w:tc>
+          <w:tcPr>
+            <w:tcW w:w="1355" w:type="dxa"/>
+          </w:tcPr>
+          <w:p>
+            <w:pPr>
+              <w:spacing w:after="160" w:line="278" w:lineRule="auto"/>
+              <w:rPr>
+                <w:rFonts w:asciiTheme="majorHAnsi" w:hAnsiTheme="majorHAnsi" w:cs="Courier New"/>
+                <w:sz w:val="18"/>
+                <w:szCs w:val="18"/>
+              </w:rPr>
+            </w:pPr>
+            <w:r>
+              <w:rPr>
+                <w:rFonts w:asciiTheme="majorHAnsi" w:hAnsiTheme="majorHAnsi" w:cs="Courier New"/>
+                <w:sz w:val="18"/>
+                <w:szCs w:val="18"/>
+              </w:rPr>
+              <w:t>pla</w:t>
+            </w:r>
+            <w:r>
+              <w:rPr>
+                <w:rFonts w:asciiTheme="majorHAnsi" w:hAnsiTheme="majorHAnsi" w:cs="Courier New"/>
+                <w:sz w:val="18"/>
+                <w:szCs w:val="18"/>
+              </w:rPr>
+              <w:t>tform</w:t>
+            </w:r>
+          </w:p>
+        </w:tc>
+        <w:tc>
+          <w:tcPr>
+            <w:tcW w:w="3466" w:type="dxa"/>
+          </w:tcPr>
+          <w:p>
+            <w:pPr>
+              <w:spacing w:after="160" w:line="278" w:lineRule="auto"/>
+              <w:rPr>
+                <w:rFonts w:asciiTheme="majorHAnsi" w:hAnsiTheme="majorHAnsi" w:cs="Courier New"/>
+                <w:sz w:val="18"/>
+                <w:szCs w:val="18"/>
+              </w:rPr>
+            </w:pPr>
+            <w:r>
+              <w:rPr>
+                <w:rFonts w:asciiTheme="majorHAnsi" w:hAnsiTheme="majorHAnsi" w:cs="Courier New"/>
+                <w:sz w:val="18"/>
+                <w:szCs w:val="18"/>
+              </w:rPr>
+              <w:t>More details</w:t>
+            </w:r>
+          </w:p>
+        </w:tc>
+      </w:tr>
+      <w:tr>
+        <w:tc>
+          <w:tcPr>
+            <w:tcW w:w="1565" w:type="dxa"/>
+          </w:tcPr>
+          <w:p>
+            <w:pPr>
+              <w:spacing w:after="160" w:line="278" w:lineRule="auto"/>
+              <w:rPr>
+                <w:rFonts w:asciiTheme="majorHAnsi" w:hAnsiTheme="majorHAnsi" w:cs="Courier New"/>
+                <w:sz w:val="18"/>
+                <w:szCs w:val="18"/>
+              </w:rPr>
+            </w:pPr>
+            <w:r>
+              <w:rPr>
+                <w:rFonts w:asciiTheme="majorHAnsi" w:hAnsiTheme="majorHAnsi" w:cs="Courier New"/>
+                <w:sz w:val="18"/>
+                <w:szCs w:val="18"/>
+              </w:rPr>
+              <w:t>MEGA</w:t>
+            </w:r>
+          </w:p>
+        </w:tc>
+        <w:tc>
+          <w:tcPr>
+            <w:tcW w:w="1671" w:type="dxa"/>
+          </w:tcPr>
+          <w:p>
+            <w:pPr>
+              <w:spacing w:after="160" w:line="278" w:lineRule="auto"/>
+              <w:rPr>
+                <w:rFonts w:asciiTheme="majorHAnsi" w:hAnsiTheme="majorHAnsi" w:cs="Courier New"/>
+                <w:sz w:val="18"/>
+                <w:szCs w:val="18"/>
+              </w:rPr>
+            </w:pPr>
+            <w:r>
+              <w:rPr>
+                <w:rFonts w:asciiTheme="majorHAnsi" w:hAnsiTheme="majorHAnsi" w:cs="Courier New"/>
+                <w:sz w:val="18"/>
+                <w:szCs w:val="18"/>
+              </w:rPr>
+              <w:t>Generate</w:t>
+            </w:r>
+            <w:r>
+              <w:rPr>
+                <w:rFonts w:asciiTheme="majorHAnsi" w:hAnsiTheme="majorHAnsi" w:cs="Courier New"/>
+                <w:sz w:val="18"/>
+                <w:szCs w:val="18"/>
+              </w:rPr>
+              <w:t xml:space="preserve"> protein model  </w:t>
+            </w:r>
+          </w:p>
+        </w:tc>
+        <w:tc>
+          <w:tcPr>
+            <w:tcW w:w="1568" w:type="dxa"/>
+          </w:tcPr>
+          <w:p>
+            <w:pPr>
+              <w:spacing w:after="160" w:line="278" w:lineRule="auto"/>
+              <w:rPr>
+                <w:rFonts w:asciiTheme="majorHAnsi" w:hAnsiTheme="majorHAnsi" w:cs="Courier New"/>
+                <w:sz w:val="18"/>
+                <w:szCs w:val="18"/>
+              </w:rPr>
+            </w:pPr>
+            <w:r>
+              <w:rPr>
+                <w:rFonts w:asciiTheme="majorHAnsi" w:hAnsiTheme="majorHAnsi" w:cs="Courier New"/>
+                <w:sz w:val="18"/>
+                <w:szCs w:val="18"/>
+              </w:rPr>
+              <w:t>Excel sheet</w:t>
+            </w:r>
+          </w:p>
+        </w:tc>
+        <w:tc>
+          <w:tcPr>
+            <w:tcW w:w="1355" w:type="dxa"/>
+          </w:tcPr>
+          <w:p>
+            <w:pPr>
+              <w:spacing w:after="160" w:line="278" w:lineRule="auto"/>
+              <w:rPr>
+                <w:rFonts w:asciiTheme="majorHAnsi" w:hAnsiTheme="majorHAnsi" w:cs="Courier New"/>
+                <w:sz w:val="18"/>
+                <w:szCs w:val="18"/>
+              </w:rPr>
+            </w:pPr>
+            <w:r>
+              <w:rPr>
+                <w:rFonts w:asciiTheme="majorHAnsi" w:hAnsiTheme="majorHAnsi" w:cs="Courier New"/>
+                <w:sz w:val="18"/>
+                <w:szCs w:val="18"/>
+              </w:rPr>
+              <w:t>W</w:t>
+            </w:r>
+            <w:r>
+              <w:rPr>
+                <w:rFonts w:asciiTheme="majorHAnsi" w:hAnsiTheme="majorHAnsi" w:cs="Courier New"/>
+                <w:sz w:val="18"/>
+                <w:szCs w:val="18"/>
+              </w:rPr>
+              <w:t>eb in</w:t>
+            </w:r>
+            <w:r>
+              <w:rPr>
+                <w:rFonts w:asciiTheme="majorHAnsi" w:hAnsiTheme="majorHAnsi" w:cs="Courier New"/>
+                <w:sz w:val="18"/>
+                <w:szCs w:val="18"/>
+              </w:rPr>
+              <w:t xml:space="preserve">terface </w:t>
+            </w:r>
+          </w:p>
+        </w:tc>
+        <w:tc>
+          <w:tcPr>
+            <w:tcW w:w="3466" w:type="dxa"/>
+          </w:tcPr>
+          <w:p>
+            <w:pPr>
+              <w:spacing w:after="160" w:line="278" w:lineRule="auto"/>
+              <w:rPr>
+                <w:rFonts w:asciiTheme="majorHAnsi" w:hAnsiTheme="majorHAnsi" w:cs="Courier New"/>
+                <w:sz w:val="18"/>
+                <w:szCs w:val="18"/>
+              </w:rPr>
+            </w:pPr>
+            <w:r>
+              <w:rPr>
+                <w:rFonts w:asciiTheme="majorHAnsi" w:hAnsiTheme="majorHAnsi" w:cs="Courier New"/>
+                <w:sz w:val="18"/>
+                <w:szCs w:val="18"/>
+              </w:rPr>
+              <w:t>N/A</w:t>
+            </w:r>
+          </w:p>
+          <w:p>
+            <w:pPr>
+              <w:spacing w:after="160" w:line="278" w:lineRule="auto"/>
+              <w:rPr>
+                <w:rFonts w:asciiTheme="majorHAnsi" w:hAnsiTheme="majorHAnsi" w:cs="Courier New"/>
+                <w:sz w:val="18"/>
+                <w:szCs w:val="18"/>
+              </w:rPr>
+            </w:pPr>
+            <w:r>
+              <w:rPr>
+                <w:rFonts w:asciiTheme="majorHAnsi" w:hAnsiTheme="majorHAnsi" w:cs="Courier New"/>
+                <w:sz w:val="18"/>
+                <w:szCs w:val="18"/>
+              </w:rPr>
+              <w:t>‘</w:t>
+            </w:r>
+            <w:proofErr w:type="gramStart"/>
+            <w:r>
+              <w:rPr>
+                <w:rFonts w:asciiTheme="majorHAnsi" w:hAnsiTheme="majorHAnsi" w:cs="Courier New"/>
+                <w:sz w:val="18"/>
+                <w:szCs w:val="18"/>
+              </w:rPr>
+              <w:t>find</w:t>
+            </w:r>
+            <w:proofErr w:type="gramEnd"/>
+            <w:r>
+              <w:rPr>
+                <w:rFonts w:asciiTheme="majorHAnsi" w:hAnsiTheme="majorHAnsi" w:cs="Courier New"/>
+                <w:sz w:val="18"/>
+                <w:szCs w:val="18"/>
+              </w:rPr>
+              <w:t xml:space="preserve"> best </w:t>
+            </w:r>
+            <w:r>
+              <w:rPr>
+                <w:rFonts w:asciiTheme="majorHAnsi" w:hAnsiTheme="majorHAnsi" w:cs="Courier New"/>
+                <w:sz w:val="18"/>
+                <w:szCs w:val="18"/>
+              </w:rPr>
+              <w:t>DNA/protein models</w:t>
+            </w:r>
+            <w:r>
+              <w:rPr>
+                <w:rFonts w:asciiTheme="majorHAnsi" w:hAnsiTheme="majorHAnsi" w:cs="Courier New"/>
+                <w:sz w:val="18"/>
+                <w:szCs w:val="18"/>
+              </w:rPr>
+              <w:t>’</w:t>
+            </w:r>
+          </w:p>
+        </w:tc>
+      </w:tr>
+      <w:tr>
+        <w:tc>
+          <w:tcPr>
+            <w:tcW w:w="1565" w:type="dxa"/>
+          </w:tcPr>
+          <w:p>
+            <w:pPr>
+              <w:spacing w:after="160" w:line="278" w:lineRule="auto"/>
+              <w:rPr>
+                <w:rFonts w:asciiTheme="majorHAnsi" w:hAnsiTheme="majorHAnsi" w:cs="Courier New"/>
+                <w:sz w:val="18"/>
+                <w:szCs w:val="18"/>
+              </w:rPr>
+            </w:pPr>
+            <w:r>
+              <w:rPr>
+                <w:rFonts w:asciiTheme="majorHAnsi" w:hAnsiTheme="majorHAnsi" w:cs="Courier New"/>
+                <w:sz w:val="18"/>
+                <w:szCs w:val="18"/>
+              </w:rPr>
+              <w:t>IQ-Tree</w:t>
+            </w:r>
+          </w:p>
+        </w:tc>
+        <w:tc>
+          <w:tcPr>
+            <w:tcW w:w="1671" w:type="dxa"/>
+          </w:tcPr>
+          <w:p>
+            <w:pPr>
+              <w:spacing w:after="160" w:line="278" w:lineRule="auto"/>
+              <w:rPr>
+                <w:rFonts w:asciiTheme="majorHAnsi" w:hAnsiTheme="majorHAnsi" w:cs="Courier New"/>
+                <w:sz w:val="18"/>
+                <w:szCs w:val="18"/>
+              </w:rPr>
+            </w:pPr>
+            <w:r>
+              <w:rPr>
+                <w:rFonts w:asciiTheme="majorHAnsi" w:hAnsiTheme="majorHAnsi" w:cs="Courier New"/>
+                <w:sz w:val="18"/>
+                <w:szCs w:val="18"/>
+              </w:rPr>
+              <w:t>Generate</w:t>
+            </w:r>
+            <w:r>
+              <w:rPr>
+                <w:rFonts w:asciiTheme="majorHAnsi" w:hAnsiTheme="majorHAnsi" w:cs="Courier New"/>
+                <w:sz w:val="18"/>
+                <w:szCs w:val="18"/>
+              </w:rPr>
+              <w:t xml:space="preserve"> phylogenetic tree</w:t>
+            </w:r>
+          </w:p>
+        </w:tc>
+        <w:tc>
+          <w:tcPr>
+            <w:tcW w:w="1568" w:type="dxa"/>
+          </w:tcPr>
+          <w:p>
+            <w:pPr>
+              <w:spacing w:after="160" w:line="278" w:lineRule="auto"/>
+              <w:rPr>
+                <w:rFonts w:asciiTheme="majorHAnsi" w:hAnsiTheme="majorHAnsi" w:cs="Courier New"/>
+                <w:sz w:val="18"/>
+                <w:szCs w:val="18"/>
+              </w:rPr>
+            </w:pPr>
+            <w:proofErr w:type="gramStart"/>
+            <w:r>
+              <w:rPr>
+                <w:rFonts w:asciiTheme="majorHAnsi" w:hAnsiTheme="majorHAnsi" w:cs="Courier New"/>
+                <w:sz w:val="18"/>
+                <w:szCs w:val="18"/>
+              </w:rPr>
+              <w:t>.</w:t>
+            </w:r>
+            <w:proofErr w:type="spellStart"/>
+            <w:r>
+              <w:rPr>
+                <w:rFonts w:asciiTheme="majorHAnsi" w:hAnsiTheme="majorHAnsi" w:cs="Courier New"/>
+                <w:sz w:val="18"/>
+                <w:szCs w:val="18"/>
+              </w:rPr>
+              <w:t>treefile</w:t>
+            </w:r>
+            <w:proofErr w:type="spellEnd"/>
+            <w:proofErr w:type="gramEnd"/>
+          </w:p>
+        </w:tc>
+        <w:tc>
+          <w:tcPr>
+            <w:tcW w:w="1355" w:type="dxa"/>
+          </w:tcPr>
+          <w:p>
+            <w:pPr>
+              <w:spacing w:after="160" w:line="278" w:lineRule="auto"/>
+              <w:rPr>
+                <w:rFonts w:asciiTheme="majorHAnsi" w:hAnsiTheme="majorHAnsi" w:cs="Courier New"/>
+                <w:sz w:val="18"/>
+                <w:szCs w:val="18"/>
+              </w:rPr>
+            </w:pPr>
+            <w:r>
+              <w:rPr>
+                <w:rFonts w:asciiTheme="majorHAnsi" w:hAnsiTheme="majorHAnsi" w:cs="Courier New"/>
+                <w:sz w:val="18"/>
+                <w:szCs w:val="18"/>
+              </w:rPr>
+              <w:t>Command line</w:t>
+            </w:r>
+          </w:p>
+        </w:tc>
+        <w:tc>
+          <w:tcPr>
+            <w:tcW w:w="3466" w:type="dxa"/>
+          </w:tcPr>
+          <w:p>
+            <w:pPr>
+              <w:spacing w:after="160" w:line="278" w:lineRule="auto"/>
+              <w:rPr>
+                <w:rFonts w:ascii="Cascadia Code" w:hAnsi="Cascadia Code" w:cs="Cascadia Code"/>
+                <w:sz w:val="18"/>
+                <w:szCs w:val="18"/>
+              </w:rPr>
+            </w:pPr>
+            <w:r>
+              <w:rPr>
+                <w:rFonts w:ascii="Cascadia Code" w:hAnsi="Cascadia Code" w:cs="Cascadia Code"/>
+                <w:sz w:val="14"/>
+                <w:szCs w:val="14"/>
+              </w:rPr>
+              <w:t xml:space="preserve"> ..\..\..\..\bin\iqtree3.exe -s .\AGXT_NP_000021.1_match_renamed.fasta -m JTT+G+I+F</w:t>
+            </w:r>
+          </w:p>
+        </w:tc>
+      </w:tr>
+      <w:tr>
+        <w:tc>
+          <w:tcPr>
+            <w:tcW w:w="1565" w:type="dxa"/>
+          </w:tcPr>
+          <w:p>
+            <w:pPr>
+              <w:spacing w:after="160" w:line="278" w:lineRule="auto"/>
+              <w:rPr>
+                <w:rFonts w:asciiTheme="majorHAnsi" w:hAnsiTheme="majorHAnsi" w:cs="Courier New"/>
+                <w:sz w:val="18"/>
+                <w:szCs w:val="18"/>
+              </w:rPr>
+            </w:pPr>
+            <w:proofErr w:type="spellStart"/>
+            <w:r>
+              <w:rPr>
+                <w:rFonts w:asciiTheme="majorHAnsi" w:hAnsiTheme="majorHAnsi" w:cs="Courier New"/>
+                <w:sz w:val="18"/>
+                <w:szCs w:val="18"/>
+              </w:rPr>
+              <w:t>FastML</w:t>
+            </w:r>
+            <w:proofErr w:type="spellEnd"/>
+          </w:p>
+        </w:tc>
+        <w:tc>
+          <w:tcPr>
+            <w:tcW w:w="1671" w:type="dxa"/>
+          </w:tcPr>
+          <w:p>
+            <w:pPr>
+              <w:spacing w:after="160" w:line="278" w:lineRule="auto"/>
+              <w:rPr>
+                <w:rFonts w:asciiTheme="majorHAnsi" w:hAnsiTheme="majorHAnsi" w:cs="Courier New"/>
+                <w:sz w:val="18"/>
+                <w:szCs w:val="18"/>
+              </w:rPr>
+            </w:pPr>
+            <w:r>
+              <w:rPr>
+                <w:rFonts w:asciiTheme="majorHAnsi" w:hAnsiTheme="majorHAnsi" w:cs="Courier New"/>
+                <w:sz w:val="18"/>
+                <w:szCs w:val="18"/>
+              </w:rPr>
+              <w:t>Generate</w:t>
+            </w:r>
+            <w:r>
+              <w:rPr>
+                <w:rFonts w:asciiTheme="majorHAnsi" w:hAnsiTheme="majorHAnsi" w:cs="Courier New"/>
+                <w:sz w:val="18"/>
+                <w:szCs w:val="18"/>
+              </w:rPr>
+              <w:t xml:space="preserve"> ancestral state sequence</w:t>
+            </w:r>
+          </w:p>
+        </w:tc>
+        <w:tc>
+          <w:tcPr>
+            <w:tcW w:w="1568" w:type="dxa"/>
+          </w:tcPr>
+          <w:p>
+            <w:pPr>
+              <w:spacing w:after="160" w:line="278" w:lineRule="auto"/>
+              <w:rPr>
+                <w:rFonts w:asciiTheme="majorHAnsi" w:hAnsiTheme="majorHAnsi" w:cs="Courier New"/>
+                <w:sz w:val="18"/>
+                <w:szCs w:val="18"/>
+              </w:rPr>
+            </w:pPr>
+          </w:p>
+        </w:tc>
+        <w:tc>
+          <w:tcPr>
+            <w:tcW w:w="1355" w:type="dxa"/>
+          </w:tcPr>
+          <w:p>
+            <w:pPr>
+              <w:spacing w:after="160" w:line="278" w:lineRule="auto"/>
+              <w:rPr>
+                <w:rFonts w:asciiTheme="majorHAnsi" w:hAnsiTheme="majorHAnsi" w:cs="Courier New"/>
+                <w:sz w:val="18"/>
+                <w:szCs w:val="18"/>
+              </w:rPr>
+            </w:pPr>
+          </w:p>
+        </w:tc>
+        <w:tc>
+          <w:tcPr>
+            <w:tcW w:w="3466" w:type="dxa"/>
+          </w:tcPr>
+          <w:p>
+            <w:pPr>
+              <w:spacing w:after="160" w:line="278" w:lineRule="auto"/>
+              <w:rPr>
+                <w:rFonts w:ascii="Cascadia Code" w:hAnsi="Cascadia Code" w:cs="Cascadia Code"/>
+                <w:sz w:val="14"/>
+                <w:szCs w:val="14"/>
+              </w:rPr>
+            </w:pPr>
+            <w:proofErr w:type="spellStart"/>
+            <w:r>
+              <w:rPr>
+                <w:rFonts w:ascii="Cascadia Code" w:hAnsi="Cascadia Code" w:cs="Cascadia Code"/>
+                <w:sz w:val="14"/>
+                <w:szCs w:val="14"/>
+              </w:rPr>
+              <w:t>fastml</w:t>
+            </w:r>
+            <w:proofErr w:type="spellEnd"/>
+            <w:r>
+              <w:rPr>
+                <w:rFonts w:ascii="Cascadia Code" w:hAnsi="Cascadia Code" w:cs="Cascadia Code"/>
+                <w:sz w:val="14"/>
+                <w:szCs w:val="14"/>
+              </w:rPr>
+              <w:t xml:space="preserve"> -s ACADM_NP_000007.1_match_</w:t>
+            </w:r>
+            <w:proofErr w:type="gramStart"/>
+            <w:r>
+              <w:rPr>
+                <w:rFonts w:ascii="Cascadia Code" w:hAnsi="Cascadia Code" w:cs="Cascadia Code"/>
+                <w:sz w:val="14"/>
+                <w:szCs w:val="14"/>
+              </w:rPr>
+              <w:t>copy.fasta</w:t>
+            </w:r>
+            <w:proofErr w:type="gramEnd"/>
+            <w:r>
+              <w:rPr>
+                <w:rFonts w:ascii="Cascadia Code" w:hAnsi="Cascadia Code" w:cs="Cascadia Code"/>
+                <w:sz w:val="14"/>
+                <w:szCs w:val="14"/>
+              </w:rPr>
+              <w:t xml:space="preserve"> -t ACADM_NP_000007.1_match_</w:t>
+            </w:r>
+            <w:proofErr w:type="gramStart"/>
+            <w:r>
+              <w:rPr>
+                <w:rFonts w:ascii="Cascadia Code" w:hAnsi="Cascadia Code" w:cs="Cascadia Code"/>
+                <w:sz w:val="14"/>
+                <w:szCs w:val="14"/>
+              </w:rPr>
+              <w:t>copy.Newick</w:t>
+            </w:r>
+            <w:proofErr w:type="gramEnd"/>
+            <w:r>
+              <w:rPr>
+                <w:rFonts w:ascii="Cascadia Code" w:hAnsi="Cascadia Code" w:cs="Cascadia Code"/>
+                <w:sz w:val="14"/>
+                <w:szCs w:val="14"/>
+              </w:rPr>
+              <w:t xml:space="preserve"> </w:t>
+            </w:r>
+          </w:p>
+        </w:tc>
+      </w:tr>
+      <w:tr>
+        <w:tc>
+          <w:tcPr>
+            <w:tcW w:w="1565" w:type="dxa"/>
+          </w:tcPr>
+          <w:p>
+            <w:pPr>
+              <w:spacing w:after="160" w:line="278" w:lineRule="auto"/>
+              <w:rPr>
+                <w:rFonts w:asciiTheme="majorHAnsi" w:hAnsiTheme="majorHAnsi" w:cs="Courier New"/>
+                <w:sz w:val="18"/>
+                <w:szCs w:val="18"/>
+              </w:rPr>
+            </w:pPr>
+            <w:proofErr w:type="spellStart"/>
+            <w:r>
+              <w:rPr>
+                <w:rFonts w:asciiTheme="majorHAnsi" w:hAnsiTheme="majorHAnsi" w:cs="Courier New"/>
+                <w:sz w:val="18"/>
+                <w:szCs w:val="18"/>
+              </w:rPr>
+              <w:t>iT</w:t>
+            </w:r>
+            <w:r>
+              <w:rPr>
+                <w:rFonts w:asciiTheme="majorHAnsi" w:hAnsiTheme="majorHAnsi" w:cs="Courier New"/>
+                <w:sz w:val="18"/>
+                <w:szCs w:val="18"/>
+              </w:rPr>
+              <w:t>OL</w:t>
+            </w:r>
+            <w:proofErr w:type="spellEnd"/>
+          </w:p>
+        </w:tc>
+        <w:tc>
+          <w:tcPr>
+            <w:tcW w:w="1671" w:type="dxa"/>
+          </w:tcPr>
+          <w:p>
+            <w:pPr>
+              <w:spacing w:after="160" w:line="278" w:lineRule="auto"/>
+              <w:rPr>
+                <w:rFonts w:asciiTheme="majorHAnsi" w:hAnsiTheme="majorHAnsi" w:cs="Courier New"/>
+                <w:sz w:val="18"/>
+                <w:szCs w:val="18"/>
+              </w:rPr>
+            </w:pPr>
+            <w:r>
+              <w:rPr>
+                <w:rFonts w:asciiTheme="majorHAnsi" w:hAnsiTheme="majorHAnsi" w:cs="Courier New"/>
+                <w:sz w:val="18"/>
+                <w:szCs w:val="18"/>
+              </w:rPr>
+              <w:t xml:space="preserve">Tree annotation </w:t>
+            </w:r>
+          </w:p>
+        </w:tc>
+        <w:tc>
+          <w:tcPr>
+            <w:tcW w:w="1568" w:type="dxa"/>
+          </w:tcPr>
+          <w:p>
+            <w:pPr>
+              <w:spacing w:after="160" w:line="278" w:lineRule="auto"/>
+              <w:rPr>
+                <w:rFonts w:asciiTheme="majorHAnsi" w:hAnsiTheme="majorHAnsi" w:cs="Courier New"/>
+                <w:sz w:val="18"/>
+                <w:szCs w:val="18"/>
+              </w:rPr>
+            </w:pPr>
+          </w:p>
+        </w:tc>
+        <w:tc>
+          <w:tcPr>
+            <w:tcW w:w="1355" w:type="dxa"/>
+          </w:tcPr>
+          <w:p>
+            <w:pPr>
+              <w:spacing w:after="160" w:line="278" w:lineRule="auto"/>
+              <w:rPr>
+                <w:rFonts w:asciiTheme="majorHAnsi" w:hAnsiTheme="majorHAnsi" w:cs="Courier New"/>
+                <w:sz w:val="18"/>
+                <w:szCs w:val="18"/>
+              </w:rPr>
+            </w:pPr>
+            <w:r>
+              <w:rPr>
+                <w:rFonts w:asciiTheme="majorHAnsi" w:hAnsiTheme="majorHAnsi" w:cs="Courier New"/>
+                <w:sz w:val="18"/>
+                <w:szCs w:val="18"/>
+              </w:rPr>
+              <w:t>Web interface</w:t>
+            </w:r>
+          </w:p>
+        </w:tc>
+        <w:tc>
+          <w:tcPr>
+            <w:tcW w:w="3466" w:type="dxa"/>
+          </w:tcPr>
+          <w:p>
+            <w:pPr>
+              <w:spacing w:after="160" w:line="278" w:lineRule="auto"/>
+              <w:rPr>
+                <w:rFonts w:asciiTheme="majorHAnsi" w:hAnsiTheme="majorHAnsi" w:cs="Courier New"/>
+                <w:sz w:val="18"/>
+                <w:szCs w:val="18"/>
+              </w:rPr>
+            </w:pPr>
+          </w:p>
+        </w:tc>
+      </w:tr>
+    </w:tbl>
+    <w:p>
+      <w:pPr>
+        <w:spacing w:after="160" w:line="278" w:lineRule="auto"/>
+        <w:rPr>
+          <w:rFonts w:asciiTheme="majorHAnsi" w:hAnsiTheme="majorHAnsi" w:cs="Courier New"/>
         </w:rPr>
       </w:pPr>
     </w:p>
@@ -4122,8 +5907,12 @@
 </w:document>
 </file>
 
+<file path=word/numbering.xml><?xml version="1.0" encoding="utf-8"?>
+<w:numbering xmlns:wpc="http://schemas.microsoft.com/office/word/2010/wordprocessingCanvas" xmlns:cx="http://schemas.microsoft.com/office/drawing/2014/chartex" xmlns:cx1="http://schemas.microsoft.com/office/drawing/2015/9/8/chartex" xmlns:cx2="http://schemas.microsoft.com/office/drawing/2015/10/21/chartex" xmlns:cx3="http://schemas.microsoft.com/office/drawing/2016/5/9/chartex" xmlns:cx4="http://schemas.microsoft.com/office/drawing/2016/5/10/chartex" xmlns:cx5="http://schemas.microsoft.com/office/drawing/2016/5/11/chartex" xmlns:cx6="http://schemas.microsoft.com/office/drawing/2016/5/12/chartex" xmlns:cx7="http://schemas.microsoft.com/office/drawing/2016/5/13/chartex" xmlns:cx8="http://schemas.microsoft.com/office/drawing/2016/5/14/chartex" xmlns:mc="http://schemas.openxmlformats.org/markup-compatibility/2006" xmlns:aink="http://schemas.microsoft.com/office/drawing/2016/ink" xmlns:am3d="http://schemas.microsoft.com/office/drawing/2017/model3d" xmlns:o="urn:schemas-microsoft-com:office:office" xmlns:oel="http://schemas.microsoft.com/office/2019/extlst" xmlns:r="http://schemas.openxmlformats.org/officeDocument/2006/relationships" xmlns:m="http://schemas.openxmlformats.org/officeDocument/2006/math" xmlns:v="urn:schemas-microsoft-com:vml" xmlns:wp14="http://schemas.microsoft.com/office/word/2010/wordprocessingDrawing" xmlns:wp="http://schemas.openxmlformats.org/drawingml/2006/wordprocessingDrawing" xmlns:w10="urn:schemas-microsoft-com:office:word" xmlns:w="http://schemas.openxmlformats.org/wordprocessingml/2006/main" xmlns:w14="http://schemas.microsoft.com/office/word/2010/wordml" xmlns:w15="http://schemas.microsoft.com/office/word/2012/wordml" xmlns:w16cex="http://schemas.microsoft.com/office/word/2018/wordml/cex" xmlns:w16cid="http://schemas.microsoft.com/office/word/2016/wordml/cid" xmlns:w16="http://schemas.microsoft.com/office/word/2018/wordml" xmlns:w16du="http://schemas.microsoft.com/office/word/2023/wordml/word16du" xmlns:w16sdtdh="http://schemas.microsoft.com/office/word/2020/wordml/sdtdatahash" xmlns:w16sdtfl="http://schemas.microsoft.com/office/word/2024/wordml/sdtformatlock" xmlns:w16se="http://schemas.microsoft.com/office/word/2015/wordml/symex" xmlns:wpg="http://schemas.microsoft.com/office/word/2010/wordprocessingGroup" xmlns:wpi="http://schemas.microsoft.com/office/word/2010/wordprocessingInk" xmlns:wne="http://schemas.microsoft.com/office/word/2006/wordml" xmlns:wps="http://schemas.microsoft.com/office/word/2010/wordprocessingShape" mc:Ignorable="w14 w15 w16se w16cid w16 w16cex w16sdtdh w16sdtfl w16du wp14"/>
+</file>
+
 <file path=word/styles.xml><?xml version="1.0" encoding="utf-8"?>
-<w:styles xmlns:mc="http://schemas.openxmlformats.org/markup-compatibility/2006" xmlns:r="http://schemas.openxmlformats.org/officeDocument/2006/relationships" xmlns:w="http://schemas.openxmlformats.org/wordprocessingml/2006/main" xmlns:w14="http://schemas.microsoft.com/office/word/2010/wordml" xmlns:w15="http://schemas.microsoft.com/office/word/2012/wordml" xmlns:w16cex="http://schemas.microsoft.com/office/word/2018/wordml/cex" xmlns:w16cid="http://schemas.microsoft.com/office/word/2016/wordml/cid" xmlns:w16="http://schemas.microsoft.com/office/word/2018/wordml" xmlns:w16sdtdh="http://schemas.microsoft.com/office/word/2020/wordml/sdtdatahash" xmlns:w16sdtfl="http://schemas.microsoft.com/office/word/2024/wordml/sdtformatlock" xmlns:w16se="http://schemas.microsoft.com/office/word/2015/wordml/symex" xmlns:w16du="http://schemas.microsoft.com/office/word/2023/wordml/word16du" mc:Ignorable="w14 w15 w16se w16cid w16 w16cex w16sdtdh w16sdtfl w16du">
+<w:styles xmlns:mc="http://schemas.openxmlformats.org/markup-compatibility/2006" xmlns:r="http://schemas.openxmlformats.org/officeDocument/2006/relationships" xmlns:w="http://schemas.openxmlformats.org/wordprocessingml/2006/main" xmlns:w14="http://schemas.microsoft.com/office/word/2010/wordml" xmlns:w15="http://schemas.microsoft.com/office/word/2012/wordml" xmlns:w16cex="http://schemas.microsoft.com/office/word/2018/wordml/cex" xmlns:w16cid="http://schemas.microsoft.com/office/word/2016/wordml/cid" xmlns:w16="http://schemas.microsoft.com/office/word/2018/wordml" xmlns:w16du="http://schemas.microsoft.com/office/word/2023/wordml/word16du" xmlns:w16sdtdh="http://schemas.microsoft.com/office/word/2020/wordml/sdtdatahash" xmlns:w16sdtfl="http://schemas.microsoft.com/office/word/2024/wordml/sdtformatlock" xmlns:w16se="http://schemas.microsoft.com/office/word/2015/wordml/symex" mc:Ignorable="w14 w15 w16se w16cid w16 w16cex w16sdtdh w16sdtfl w16du">
   <w:docDefaults>
     <w:rPrDefault>
       <w:rPr>
@@ -5102,6 +6891,48 @@
       <w:spacing w:before="100" w:beforeAutospacing="1" w:after="100" w:afterAutospacing="1"/>
     </w:pPr>
   </w:style>
+  <w:style w:type="character" w:styleId="Hyperlink">
+    <w:name w:val="Hyperlink"/>
+    <w:basedOn w:val="DefaultParagraphFont"/>
+    <w:uiPriority w:val="99"/>
+    <w:unhideWhenUsed/>
+    <w:rsid w:val="00422AE2"/>
+    <w:rPr>
+      <w:color w:val="467886" w:themeColor="hyperlink"/>
+      <w:u w:val="single"/>
+    </w:rPr>
+  </w:style>
+  <w:style w:type="character" w:styleId="UnresolvedMention">
+    <w:name w:val="Unresolved Mention"/>
+    <w:basedOn w:val="DefaultParagraphFont"/>
+    <w:uiPriority w:val="99"/>
+    <w:semiHidden/>
+    <w:unhideWhenUsed/>
+    <w:rsid w:val="00422AE2"/>
+    <w:rPr>
+      <w:color w:val="605E5C"/>
+      <w:shd w:val="clear" w:color="auto" w:fill="E1DFDD"/>
+    </w:rPr>
+  </w:style>
+  <w:style w:type="table" w:styleId="TableGrid">
+    <w:name w:val="Table Grid"/>
+    <w:basedOn w:val="TableNormal"/>
+    <w:uiPriority w:val="39"/>
+    <w:rsid w:val="003F07A6"/>
+    <w:pPr>
+      <w:spacing w:after="0" w:line="240" w:lineRule="auto"/>
+    </w:pPr>
+    <w:tblPr>
+      <w:tblBorders>
+        <w:top w:val="single" w:sz="4" w:space="0" w:color="auto"/>
+        <w:left w:val="single" w:sz="4" w:space="0" w:color="auto"/>
+        <w:bottom w:val="single" w:sz="4" w:space="0" w:color="auto"/>
+        <w:right w:val="single" w:sz="4" w:space="0" w:color="auto"/>
+        <w:insideH w:val="single" w:sz="4" w:space="0" w:color="auto"/>
+        <w:insideV w:val="single" w:sz="4" w:space="0" w:color="auto"/>
+      </w:tblBorders>
+    </w:tblPr>
+  </w:style>
 </w:styles>
 </file>
 
@@ -5405,7 +7236,7 @@
 </file>
 
 <file path=customXml/itemProps1.xml><?xml version="1.0" encoding="utf-8"?>
-<ds:datastoreItem xmlns:ds="http://schemas.openxmlformats.org/officeDocument/2006/customXml" ds:itemID="{A8C94C99-25F1-B640-BE54-7137AE0FCB27}">
+<ds:datastoreItem xmlns:ds="http://schemas.openxmlformats.org/officeDocument/2006/customXml" ds:itemID="{C4953164-2BCF-6044-B75C-5324EB9548A4}">
   <ds:schemaRefs>
     <ds:schemaRef ds:uri="http://schemas.openxmlformats.org/officeDocument/2006/bibliography"/>
   </ds:schemaRefs>

</xml_diff>